<commit_message>
Proposal v3 FINAL: Group 11 filled in; this is the file submitted to Canvas Sep 8
Co-Authored-By: Claude Fable 5.1 <noreply@anthropic.com>
</commit_message>
<xml_diff>
--- a/docs/proposal/Proposal_v3_FINAL.docx
+++ b/docs/proposal/Proposal_v3_FINAL.docx
@@ -28,10 +28,10 @@
       <w:r>
         <w:rPr>
           <w:rFonts w:ascii="Calibri" w:cs="Calibri" w:eastAsia="Calibri" w:hAnsi="Calibri"/>
-          <w:sz w:val="20"/>
-          <w:szCs w:val="20"/>
-        </w:rPr>
-        <w:t xml:space="preserve">GBUS 8496 Machine Learning and AI for Business · Prof. Michael Albert · Group [#] · September 8, 2026</w:t>
+          <w:sz w:val="22"/>
+          <w:szCs w:val="22"/>
+        </w:rPr>
+        <w:t xml:space="preserve">GBUS 8496 Machine Learning and AI for Business · Prof. Michael Albert · Group 11 · September 8, 2026</w:t>
       </w:r>
     </w:p>
     <w:p>
@@ -46,16 +46,16 @@
           <w:bCs/>
           <w:i w:val="false"/>
           <w:iCs w:val="false"/>
-          <w:sz w:val="20"/>
-          <w:szCs w:val="20"/>
+          <w:sz w:val="22"/>
+          <w:szCs w:val="22"/>
         </w:rPr>
         <w:t xml:space="preserve">Team: </w:t>
       </w:r>
       <w:r>
         <w:rPr>
           <w:rFonts w:ascii="Calibri" w:cs="Calibri" w:eastAsia="Calibri" w:hAnsi="Calibri"/>
-          <w:sz w:val="20"/>
-          <w:szCs w:val="20"/>
+          <w:sz w:val="22"/>
+          <w:szCs w:val="22"/>
         </w:rPr>
         <w:t xml:space="preserve">Bakul Badwal · Malorie Black · Reid Jacobson · Thadeus Knospe · Rodolfo Perez-Cortes Manrique</w:t>
       </w:r>
@@ -69,8 +69,8 @@
           <w:rFonts w:ascii="Calibri" w:cs="Calibri" w:eastAsia="Calibri" w:hAnsi="Calibri"/>
           <w:b/>
           <w:bCs/>
-          <w:sz w:val="22"/>
-          <w:szCs w:val="22"/>
+          <w:sz w:val="24"/>
+          <w:szCs w:val="24"/>
         </w:rPr>
         <w:t xml:space="preserve">Problem and business application</w:t>
       </w:r>
@@ -83,8 +83,8 @@
       <w:r>
         <w:rPr>
           <w:rFonts w:ascii="Calibri" w:cs="Calibri" w:eastAsia="Calibri" w:hAnsi="Calibri"/>
-          <w:sz w:val="20"/>
-          <w:szCs w:val="20"/>
+          <w:sz w:val="22"/>
+          <w:szCs w:val="22"/>
         </w:rPr>
         <w:t xml:space="preserve">Most nonprofits acquire a donor once and never hear from them again. The highest-leverage moment in the donor lifecycle is the second gift, and the organizations least equipped to work it are small ones. Our stakeholder is the development lead at a nonprofit with roughly a $500K annual budget and no dedicated data staff. Each month she can personally follow up with only a fraction of the people who gave for the first time, and today she builds that list by hand from recency and gift size.</w:t>
       </w:r>
@@ -97,8 +97,8 @@
       <w:r>
         <w:rPr>
           <w:rFonts w:ascii="Calibri" w:cs="Calibri" w:eastAsia="Calibri" w:hAnsi="Calibri"/>
-          <w:sz w:val="20"/>
-          <w:szCs w:val="20"/>
+          <w:sz w:val="22"/>
+          <w:szCs w:val="22"/>
         </w:rPr>
         <w:t xml:space="preserve">The decision we support is specific: given a fixed outreach budget measured in staff hours, which first-time donors should receive follow-up, and where should the cutoff sit? Our output is a ranked, scored follow-up list with a recommended threshold and the expected dollars behind it. One of us founded GoGood Technologies, a volunteer and donor engagement platform serving exactly this customer, so we can validate the output against real practitioners.</w:t>
       </w:r>
@@ -112,8 +112,8 @@
           <w:rFonts w:ascii="Calibri" w:cs="Calibri" w:eastAsia="Calibri" w:hAnsi="Calibri"/>
           <w:b/>
           <w:bCs/>
-          <w:sz w:val="22"/>
-          <w:szCs w:val="22"/>
+          <w:sz w:val="24"/>
+          <w:szCs w:val="24"/>
         </w:rPr>
         <w:t xml:space="preserve">Dataset and source</w:t>
       </w:r>
@@ -130,16 +130,16 @@
           <w:bCs w:val="false"/>
           <w:i/>
           <w:iCs/>
-          <w:sz w:val="20"/>
-          <w:szCs w:val="20"/>
+          <w:sz w:val="22"/>
+          <w:szCs w:val="22"/>
         </w:rPr>
         <w:t xml:space="preserve">DonorsChoose Open Data, United States, 2002–2019</w:t>
       </w:r>
       <w:r>
         <w:rPr>
           <w:rFonts w:ascii="Calibri" w:cs="Calibri" w:eastAsia="Calibri" w:hAnsi="Calibri"/>
-          <w:sz w:val="20"/>
-          <w:szCs w:val="20"/>
+          <w:sz w:val="22"/>
+          <w:szCs w:val="22"/>
         </w:rPr>
         <w:t xml:space="preserve"> (ICPSR 37898, https://doi.org/10.3886/ICPSR37898.v1). Public-use files; free, with a no-cost ICPSR account and no institutional membership required. We use two files: Donations (11,377,479 records) and Projects public-use data (2,149,817 records), covering projects posted September 2002 through June 2019 with activity through December 2019; record counts confirmed against the DOI registration. Donations carries DONOR_ID, so we can reconstruct each donor's giving history and build our own outcome label rather than inheriting someone else's. It also carries AMOUNT, CREATED_MONTH, DONOR_TYPE, PAYMENT_WAS_MATCHED, IS_TEACHER_REFERRED, and THANK_YOU_PACKET_MAILED. Two constraints we accept up front: dates are month-level, and there is no donor demographics file, so DONOR_TYPE is our only donor attribute.</w:t>
       </w:r>
@@ -153,8 +153,8 @@
           <w:rFonts w:ascii="Calibri" w:cs="Calibri" w:eastAsia="Calibri" w:hAnsi="Calibri"/>
           <w:b/>
           <w:bCs/>
-          <w:sz w:val="22"/>
-          <w:szCs w:val="22"/>
+          <w:sz w:val="24"/>
+          <w:szCs w:val="24"/>
         </w:rPr>
         <w:t xml:space="preserve">What we will build</w:t>
       </w:r>
@@ -167,8 +167,8 @@
       <w:r>
         <w:rPr>
           <w:rFonts w:ascii="Calibri" w:cs="Calibri" w:eastAsia="Calibri" w:hAnsi="Calibri"/>
-          <w:sz w:val="20"/>
-          <w:szCs w:val="20"/>
+          <w:sz w:val="22"/>
+          <w:szCs w:val="22"/>
         </w:rPr>
         <w:t xml:space="preserve">A second-gift model plus a decision layer on top of it.</w:t>
       </w:r>
@@ -189,16 +189,16 @@
           <w:bCs/>
           <w:i w:val="false"/>
           <w:iCs w:val="false"/>
-          <w:sz w:val="20"/>
-          <w:szCs w:val="20"/>
+          <w:sz w:val="22"/>
+          <w:szCs w:val="22"/>
         </w:rPr>
         <w:t xml:space="preserve">Label. </w:t>
       </w:r>
       <w:r>
         <w:rPr>
           <w:rFonts w:ascii="Calibri" w:cs="Calibri" w:eastAsia="Calibri" w:hAnsi="Calibri"/>
-          <w:sz w:val="20"/>
-          <w:szCs w:val="20"/>
+          <w:sz w:val="22"/>
+          <w:szCs w:val="22"/>
         </w:rPr>
         <w:t xml:space="preserve">For each donor whose first recorded donation falls in the observation window, did they give again within 12 months? Only cohorts whose 12-month window closes before December 2019 are labeled.</w:t>
       </w:r>
@@ -219,16 +219,16 @@
           <w:bCs/>
           <w:i w:val="false"/>
           <w:iCs w:val="false"/>
-          <w:sz w:val="20"/>
-          <w:szCs w:val="20"/>
+          <w:sz w:val="22"/>
+          <w:szCs w:val="22"/>
         </w:rPr>
         <w:t xml:space="preserve">Features. </w:t>
       </w:r>
       <w:r>
         <w:rPr>
           <w:rFonts w:ascii="Calibri" w:cs="Calibri" w:eastAsia="Calibri" w:hAnsi="Calibri"/>
-          <w:sz w:val="20"/>
-          <w:szCs w:val="20"/>
+          <w:sz w:val="22"/>
+          <w:szCs w:val="22"/>
         </w:rPr>
         <w:t xml:space="preserve">Donation-side (amount, month and seasonality, matched, campaign gift card, teacher-referred, donor type, thank-you packet mailed) and project-side (subject category, grade level, cost, school state).</w:t>
       </w:r>
@@ -249,16 +249,16 @@
           <w:bCs/>
           <w:i w:val="false"/>
           <w:iCs w:val="false"/>
-          <w:sz w:val="20"/>
-          <w:szCs w:val="20"/>
+          <w:sz w:val="22"/>
+          <w:szCs w:val="22"/>
         </w:rPr>
         <w:t xml:space="preserve">Split. </w:t>
       </w:r>
       <w:r>
         <w:rPr>
           <w:rFonts w:ascii="Calibri" w:cs="Calibri" w:eastAsia="Calibri" w:hAnsi="Calibri"/>
-          <w:sz w:val="20"/>
-          <w:szCs w:val="20"/>
+          <w:sz w:val="22"/>
+          <w:szCs w:val="22"/>
         </w:rPr>
         <w:t xml:space="preserve">Time-based, not random. Train on first-gift cohorts through 2016, hold out the 2017 and 2018 cohorts, and observe outcomes through December 2019. A random split would leak future information.</w:t>
       </w:r>
@@ -279,16 +279,16 @@
           <w:bCs/>
           <w:i w:val="false"/>
           <w:iCs w:val="false"/>
-          <w:sz w:val="20"/>
-          <w:szCs w:val="20"/>
+          <w:sz w:val="22"/>
+          <w:szCs w:val="22"/>
         </w:rPr>
         <w:t xml:space="preserve">Decision layer. </w:t>
       </w:r>
       <w:r>
         <w:rPr>
           <w:rFonts w:ascii="Calibri" w:cs="Calibri" w:eastAsia="Calibri" w:hAnsi="Calibri"/>
-          <w:sz w:val="20"/>
-          <w:szCs w:val="20"/>
+          <w:sz w:val="22"/>
+          <w:szCs w:val="22"/>
         </w:rPr>
         <w:t xml:space="preserve">Convert predicted probability and predicted second-gift amount into expected value per contact, subtract an explicit cost per contact in staff time, and derive the threshold from those payoffs rather than tuning it.</w:t>
       </w:r>
@@ -302,8 +302,8 @@
           <w:rFonts w:ascii="Calibri" w:cs="Calibri" w:eastAsia="Calibri" w:hAnsi="Calibri"/>
           <w:b/>
           <w:bCs/>
-          <w:sz w:val="22"/>
-          <w:szCs w:val="22"/>
+          <w:sz w:val="24"/>
+          <w:szCs w:val="24"/>
         </w:rPr>
         <w:t xml:space="preserve">Evaluation</w:t>
       </w:r>
@@ -316,8 +316,8 @@
       <w:r>
         <w:rPr>
           <w:rFonts w:ascii="Calibri" w:cs="Calibri" w:eastAsia="Calibri" w:hAnsi="Calibri"/>
-          <w:sz w:val="20"/>
-          <w:szCs w:val="20"/>
+          <w:sz w:val="22"/>
+          <w:szCs w:val="22"/>
         </w:rPr>
         <w:t xml:space="preserve">Our ground truth is observed donor behavior in the held-out cohorts, not hand labels. Four measurements:</w:t>
       </w:r>
@@ -338,16 +338,16 @@
           <w:bCs/>
           <w:i w:val="false"/>
           <w:iCs w:val="false"/>
-          <w:sz w:val="20"/>
-          <w:szCs w:val="20"/>
+          <w:sz w:val="22"/>
+          <w:szCs w:val="22"/>
         </w:rPr>
         <w:t xml:space="preserve">Discrimination and calibration </w:t>
       </w:r>
       <w:r>
         <w:rPr>
           <w:rFonts w:ascii="Calibri" w:cs="Calibri" w:eastAsia="Calibri" w:hAnsi="Calibri"/>
-          <w:sz w:val="20"/>
-          <w:szCs w:val="20"/>
+          <w:sz w:val="22"/>
+          <w:szCs w:val="22"/>
         </w:rPr>
         <w:t xml:space="preserve">on the held-out cohorts. PR-AUC because the class is imbalanced, plus a calibration curve, since an uncalibrated score cannot support a threshold recommendation.</w:t>
       </w:r>
@@ -368,16 +368,16 @@
           <w:bCs/>
           <w:i w:val="false"/>
           <w:iCs w:val="false"/>
-          <w:sz w:val="20"/>
-          <w:szCs w:val="20"/>
+          <w:sz w:val="22"/>
+          <w:szCs w:val="22"/>
         </w:rPr>
         <w:t xml:space="preserve">Against honest baselines. </w:t>
       </w:r>
       <w:r>
         <w:rPr>
           <w:rFonts w:ascii="Calibri" w:cs="Calibri" w:eastAsia="Calibri" w:hAnsi="Calibri"/>
-          <w:sz w:val="20"/>
-          <w:szCs w:val="20"/>
+          <w:sz w:val="22"/>
+          <w:szCs w:val="22"/>
         </w:rPr>
         <w:t xml:space="preserve">The baseline that matters is RFM, the recency-and-amount heuristic small nonprofits actually use, alongside random targeting and contact-everyone. The business metric is net value retained per hour of outreach at a fixed budget. If the model does not beat RFM, we report that as the finding.</w:t>
       </w:r>
@@ -398,16 +398,16 @@
           <w:bCs/>
           <w:i w:val="false"/>
           <w:iCs w:val="false"/>
-          <w:sz w:val="20"/>
-          <w:szCs w:val="20"/>
+          <w:sz w:val="22"/>
+          <w:szCs w:val="22"/>
         </w:rPr>
         <w:t xml:space="preserve">Does stewardship predict retention? </w:t>
       </w:r>
       <w:r>
         <w:rPr>
           <w:rFonts w:ascii="Calibri" w:cs="Calibri" w:eastAsia="Calibri" w:hAnsi="Calibri"/>
-          <w:sz w:val="20"/>
-          <w:szCs w:val="20"/>
+          <w:sz w:val="22"/>
+          <w:szCs w:val="22"/>
         </w:rPr>
         <w:t xml:space="preserve">THANK_YOU_PACKET_MAILED records a real post-gift action. We estimate its association with a second gift while controlling for gift size, and state plainly that packets were not randomly assigned, so this is association and not a causal effect.</w:t>
       </w:r>
@@ -428,16 +428,16 @@
           <w:bCs/>
           <w:i w:val="false"/>
           <w:iCs w:val="false"/>
-          <w:sz w:val="20"/>
-          <w:szCs w:val="20"/>
+          <w:sz w:val="22"/>
+          <w:szCs w:val="22"/>
         </w:rPr>
         <w:t xml:space="preserve">Error analysis by cohort. </w:t>
       </w:r>
       <w:r>
         <w:rPr>
           <w:rFonts w:ascii="Calibri" w:cs="Calibri" w:eastAsia="Calibri" w:hAnsi="Calibri"/>
-          <w:sz w:val="20"/>
-          <w:szCs w:val="20"/>
+          <w:sz w:val="22"/>
+          <w:szCs w:val="22"/>
         </w:rPr>
         <w:t xml:space="preserve">We expect the model to be weakest on donors with the thinnest history, which is precisely the case our stakeholder cares about most.</w:t>
       </w:r>
@@ -454,16 +454,16 @@
           <w:bCs/>
           <w:i w:val="false"/>
           <w:iCs w:val="false"/>
-          <w:sz w:val="20"/>
-          <w:szCs w:val="20"/>
+          <w:sz w:val="22"/>
+          <w:szCs w:val="22"/>
         </w:rPr>
         <w:t xml:space="preserve">Limitation we will address head-on. </w:t>
       </w:r>
       <w:r>
         <w:rPr>
           <w:rFonts w:ascii="Calibri" w:cs="Calibri" w:eastAsia="Calibri" w:hAnsi="Calibri"/>
-          <w:sz w:val="20"/>
-          <w:szCs w:val="20"/>
+          <w:sz w:val="22"/>
+          <w:szCs w:val="22"/>
         </w:rPr>
         <w:t xml:space="preserve">DonorsChoose donors are marketplace donors who often fund classrooms they have no prior relationship with; small-nonprofit donors are relational. Rather than assume the model transfers, we test which signal survives: behavioral features (likely to transfer) versus platform-specific ones (likely not).</w:t>
       </w:r>
@@ -477,8 +477,8 @@
           <w:rFonts w:ascii="Calibri" w:cs="Calibri" w:eastAsia="Calibri" w:hAnsi="Calibri"/>
           <w:b/>
           <w:bCs/>
-          <w:sz w:val="22"/>
-          <w:szCs w:val="22"/>
+          <w:sz w:val="24"/>
+          <w:szCs w:val="24"/>
         </w:rPr>
         <w:t xml:space="preserve">What we need from you</w:t>
       </w:r>
@@ -495,8 +495,8 @@
       <w:r>
         <w:rPr>
           <w:rFonts w:ascii="Calibri" w:cs="Calibri" w:eastAsia="Calibri" w:hAnsi="Calibri"/>
-          <w:sz w:val="20"/>
-          <w:szCs w:val="20"/>
+          <w:sz w:val="22"/>
+          <w:szCs w:val="22"/>
         </w:rPr>
         <w:t xml:space="preserve">Confirmation that a well-supported negative finding against the RFM baseline is an acceptable result.</w:t>
       </w:r>
@@ -513,8 +513,8 @@
       <w:r>
         <w:rPr>
           <w:rFonts w:ascii="Calibri" w:cs="Calibri" w:eastAsia="Calibri" w:hAnsi="Calibri"/>
-          <w:sz w:val="20"/>
-          <w:szCs w:val="20"/>
+          <w:sz w:val="22"/>
+          <w:szCs w:val="22"/>
         </w:rPr>
         <w:t xml:space="preserve">Guidance on working with roughly 13 GB on JupyterHub, or approval to use a stratified sample of donor cohorts.</w:t>
       </w:r>
@@ -531,8 +531,8 @@
       <w:r>
         <w:rPr>
           <w:rFonts w:ascii="Calibri" w:cs="Calibri" w:eastAsia="Calibri" w:hAnsi="Calibri"/>
-          <w:sz w:val="20"/>
-          <w:szCs w:val="20"/>
+          <w:sz w:val="22"/>
+          <w:szCs w:val="22"/>
         </w:rPr>
         <w:t xml:space="preserve">Any concern about anchoring the framing to a company a team member founded.</w:t>
       </w:r>
@@ -744,8 +744,8 @@
     <w:rPrDefault>
       <w:rPr>
         <w:rFonts w:ascii="Calibri" w:cs="Calibri" w:eastAsia="Calibri" w:hAnsi="Calibri"/>
-        <w:sz w:val="20"/>
-        <w:szCs w:val="20"/>
+        <w:sz w:val="22"/>
+        <w:szCs w:val="22"/>
       </w:rPr>
     </w:rPrDefault>
     <w:pPrDefault/>

</xml_diff>

<commit_message>
Proposal v3 FINAL: add repository link under the team line (re-uploaded to Canvas Sep 8)
Co-Authored-By: Claude Fable 5.1 <noreply@anthropic.com>
</commit_message>
<xml_diff>
--- a/docs/proposal/Proposal_v3_FINAL.docx
+++ b/docs/proposal/Proposal_v3_FINAL.docx
@@ -36,6 +36,32 @@
     </w:p>
     <w:p>
       <w:pPr>
+        <w:spacing w:after="20" w:line="240"/>
+        <w:jc w:val="left"/>
+      </w:pPr>
+      <w:r>
+        <w:rPr>
+          <w:rFonts w:ascii="Calibri" w:cs="Calibri" w:eastAsia="Calibri" w:hAnsi="Calibri"/>
+          <w:b/>
+          <w:bCs/>
+          <w:i w:val="false"/>
+          <w:iCs w:val="false"/>
+          <w:sz w:val="22"/>
+          <w:szCs w:val="22"/>
+        </w:rPr>
+        <w:t xml:space="preserve">Team: </w:t>
+      </w:r>
+      <w:r>
+        <w:rPr>
+          <w:rFonts w:ascii="Calibri" w:cs="Calibri" w:eastAsia="Calibri" w:hAnsi="Calibri"/>
+          <w:sz w:val="22"/>
+          <w:szCs w:val="22"/>
+        </w:rPr>
+        <w:t xml:space="preserve">Bakul Badwal · Malorie Black · Reid Jacobson · Thadeus Knospe · Rodolfo Perez-Cortes Manrique</w:t>
+      </w:r>
+    </w:p>
+    <w:p>
+      <w:pPr>
         <w:spacing w:after="60" w:line="240"/>
         <w:jc w:val="left"/>
       </w:pPr>
@@ -49,15 +75,15 @@
           <w:sz w:val="22"/>
           <w:szCs w:val="22"/>
         </w:rPr>
-        <w:t xml:space="preserve">Team: </w:t>
-      </w:r>
-      <w:r>
-        <w:rPr>
-          <w:rFonts w:ascii="Calibri" w:cs="Calibri" w:eastAsia="Calibri" w:hAnsi="Calibri"/>
-          <w:sz w:val="22"/>
-          <w:szCs w:val="22"/>
-        </w:rPr>
-        <w:t xml:space="preserve">Bakul Badwal · Malorie Black · Reid Jacobson · Thadeus Knospe · Rodolfo Perez-Cortes Manrique</w:t>
+        <w:t xml:space="preserve">Repository: </w:t>
+      </w:r>
+      <w:r>
+        <w:rPr>
+          <w:rFonts w:ascii="Calibri" w:cs="Calibri" w:eastAsia="Calibri" w:hAnsi="Calibri"/>
+          <w:sz w:val="22"/>
+          <w:szCs w:val="22"/>
+        </w:rPr>
+        <w:t xml:space="preserve">github.com/bakulbadwal/gbus8496-project — this proposal, the two fallback directions we considered, the data recipe, and the working notebooks as they are built.</w:t>
       </w:r>
     </w:p>
     <w:p>

</xml_diff>